<commit_message>
feat/ added scoring logic
</commit_message>
<xml_diff>
--- a/files/answer key.docx
+++ b/files/answer key.docx
@@ -18,6 +18,12 @@
       </w:r>
     </w:p>
     <w:p>
+      <w:pPr>
+        <w:rPr>
+          <w:b/>
+          <w:bCs/>
+        </w:rPr>
+      </w:pPr>
       <w:r>
         <w:rPr>
           <w:b/>
@@ -26,24 +32,36 @@
         <w:t>Answer:</w:t>
       </w:r>
       <w:r>
-        <w:br/>
-        <w:t xml:space="preserve">The basic unit of life is the </w:t>
-      </w:r>
-      <w:r>
-        <w:rPr>
-          <w:b/>
-          <w:bCs/>
-        </w:rPr>
-        <w:t>cell</w:t>
-      </w:r>
-      <w:r>
-        <w:t>. It is the smallest structural and functional unit of all living organisms. Cells carry out essential processes such as metabolism, growth, and reproduction. All living organisms are composed of one or more cells.</w:t>
-      </w:r>
-    </w:p>
-    <w:p>
-      <w:r>
-        <w:pict w14:anchorId="1CB54C07">
-          <v:rect id="_x0000_i1079" style="width:0;height:1.5pt" o:hralign="center" o:hrstd="t" o:hr="t" fillcolor="#a0a0a0" stroked="f"/>
+        <w:rPr>
+          <w:b/>
+          <w:bCs/>
+        </w:rPr>
+        <w:br/>
+        <w:t>The basic unit of life is the cell. It is the smallest structural and functional unit of all living organisms. Cells carry out essential processes such as metabolism, growth, and reproduction. All living organisms are composed of one or more cells.</w:t>
+      </w:r>
+      <w:r>
+        <w:rPr>
+          <w:b/>
+          <w:bCs/>
+        </w:rPr>
+        <w:br/>
+        <w:t>Marks: 5</w:t>
+      </w:r>
+    </w:p>
+    <w:p>
+      <w:pPr>
+        <w:rPr>
+          <w:b/>
+          <w:bCs/>
+        </w:rPr>
+      </w:pPr>
+      <w:r>
+        <w:rPr>
+          <w:b/>
+          <w:bCs/>
+        </w:rPr>
+        <w:pict w14:anchorId="458EECB0">
+          <v:rect id="_x0000_i1124" style="width:0;height:1.5pt" o:hralign="center" o:hrstd="t" o:hr="t" fillcolor="#a0a0a0" stroked="f"/>
         </w:pict>
       </w:r>
     </w:p>
@@ -63,6 +81,12 @@
       </w:r>
     </w:p>
     <w:p>
+      <w:pPr>
+        <w:rPr>
+          <w:b/>
+          <w:bCs/>
+        </w:rPr>
+      </w:pPr>
       <w:r>
         <w:rPr>
           <w:b/>
@@ -71,14 +95,36 @@
         <w:t>Answer:</w:t>
       </w:r>
       <w:r>
+        <w:rPr>
+          <w:b/>
+          <w:bCs/>
+        </w:rPr>
         <w:br/>
         <w:t>Photosynthesis is the process by which green plants prepare their own food using sunlight. They use carbon dioxide from the air and water from the soil to produce glucose. Oxygen is released as a byproduct during this process. This process mainly occurs in the leaves.</w:t>
       </w:r>
-    </w:p>
-    <w:p>
-      <w:r>
-        <w:pict w14:anchorId="72326921">
-          <v:rect id="_x0000_i1080" style="width:0;height:1.5pt" o:hralign="center" o:hrstd="t" o:hr="t" fillcolor="#a0a0a0" stroked="f"/>
+      <w:r>
+        <w:rPr>
+          <w:b/>
+          <w:bCs/>
+        </w:rPr>
+        <w:br/>
+        <w:t>Marks: 5</w:t>
+      </w:r>
+    </w:p>
+    <w:p>
+      <w:pPr>
+        <w:rPr>
+          <w:b/>
+          <w:bCs/>
+        </w:rPr>
+      </w:pPr>
+      <w:r>
+        <w:rPr>
+          <w:b/>
+          <w:bCs/>
+        </w:rPr>
+        <w:pict w14:anchorId="171B049D">
+          <v:rect id="_x0000_i1125" style="width:0;height:1.5pt" o:hralign="center" o:hrstd="t" o:hr="t" fillcolor="#a0a0a0" stroked="f"/>
         </w:pict>
       </w:r>
     </w:p>
@@ -98,6 +144,12 @@
       </w:r>
     </w:p>
     <w:p>
+      <w:pPr>
+        <w:rPr>
+          <w:b/>
+          <w:bCs/>
+        </w:rPr>
+      </w:pPr>
       <w:r>
         <w:rPr>
           <w:b/>
@@ -106,14 +158,36 @@
         <w:t>Answer:</w:t>
       </w:r>
       <w:r>
+        <w:rPr>
+          <w:b/>
+          <w:bCs/>
+        </w:rPr>
         <w:br/>
         <w:t>The mitochondria is responsible for energy production in the cell. It generates energy in the form of ATP through cellular respiration. This energy is used for various cellular activities. Hence, it is often called the powerhouse of the cell.</w:t>
       </w:r>
-    </w:p>
-    <w:p>
-      <w:r>
-        <w:pict w14:anchorId="12F806DC">
-          <v:rect id="_x0000_i1081" style="width:0;height:1.5pt" o:hralign="center" o:hrstd="t" o:hr="t" fillcolor="#a0a0a0" stroked="f"/>
+      <w:r>
+        <w:rPr>
+          <w:b/>
+          <w:bCs/>
+        </w:rPr>
+        <w:br/>
+        <w:t>Marks: 5</w:t>
+      </w:r>
+    </w:p>
+    <w:p>
+      <w:pPr>
+        <w:rPr>
+          <w:b/>
+          <w:bCs/>
+        </w:rPr>
+      </w:pPr>
+      <w:r>
+        <w:rPr>
+          <w:b/>
+          <w:bCs/>
+        </w:rPr>
+        <w:pict w14:anchorId="028CCB5D">
+          <v:rect id="_x0000_i1126" style="width:0;height:1.5pt" o:hralign="center" o:hrstd="t" o:hr="t" fillcolor="#a0a0a0" stroked="f"/>
         </w:pict>
       </w:r>
     </w:p>
@@ -133,6 +207,12 @@
       </w:r>
     </w:p>
     <w:p>
+      <w:pPr>
+        <w:rPr>
+          <w:b/>
+          <w:bCs/>
+        </w:rPr>
+      </w:pPr>
       <w:r>
         <w:rPr>
           <w:b/>
@@ -141,14 +221,36 @@
         <w:t>Answer:</w:t>
       </w:r>
       <w:r>
+        <w:rPr>
+          <w:b/>
+          <w:bCs/>
+        </w:rPr>
         <w:br/>
         <w:t>DNA stands for Deoxyribonucleic Acid. It is the genetic material present in cells that carries hereditary information. DNA determines the traits and characteristics of an organism. It is passed from parents to offspring during reproduction.</w:t>
       </w:r>
-    </w:p>
-    <w:p>
-      <w:r>
-        <w:pict w14:anchorId="502BE0BD">
-          <v:rect id="_x0000_i1082" style="width:0;height:1.5pt" o:hralign="center" o:hrstd="t" o:hr="t" fillcolor="#a0a0a0" stroked="f"/>
+      <w:r>
+        <w:rPr>
+          <w:b/>
+          <w:bCs/>
+        </w:rPr>
+        <w:br/>
+        <w:t>Marks: 5</w:t>
+      </w:r>
+    </w:p>
+    <w:p>
+      <w:pPr>
+        <w:rPr>
+          <w:b/>
+          <w:bCs/>
+        </w:rPr>
+      </w:pPr>
+      <w:r>
+        <w:rPr>
+          <w:b/>
+          <w:bCs/>
+        </w:rPr>
+        <w:pict w14:anchorId="6E625778">
+          <v:rect id="_x0000_i1127" style="width:0;height:1.5pt" o:hralign="center" o:hrstd="t" o:hr="t" fillcolor="#a0a0a0" stroked="f"/>
         </w:pict>
       </w:r>
     </w:p>
@@ -168,6 +270,12 @@
       </w:r>
     </w:p>
     <w:p>
+      <w:pPr>
+        <w:rPr>
+          <w:b/>
+          <w:bCs/>
+        </w:rPr>
+      </w:pPr>
       <w:r>
         <w:rPr>
           <w:b/>
@@ -176,14 +284,44 @@
         <w:t>Answer:</w:t>
       </w:r>
       <w:r>
-        <w:br/>
-        <w:t>The heart is a muscular organ that pumps blood throughout the body. It supplies oxygen and nutrients to tissues and removes carbon dioxide and waste products. The heart works continuously to maintain blood circulation. It is a vital part of the circulatory system.</w:t>
-      </w:r>
-    </w:p>
-    <w:p>
-      <w:r>
-        <w:pict w14:anchorId="3E59A30E">
-          <v:rect id="_x0000_i1083" style="width:0;height:1.5pt" o:hralign="center" o:hrstd="t" o:hr="t" fillcolor="#a0a0a0" stroked="f"/>
+        <w:rPr>
+          <w:b/>
+          <w:bCs/>
+        </w:rPr>
+        <w:br/>
+        <w:t xml:space="preserve">The heart is a muscular organ that pumps blood throughout the body. It supplies oxygen and nutrients to tissues and removes carbon dioxide and waste products. The heart works continuously to maintain blood circulation. It is a vital part of the </w:t>
+      </w:r>
+      <w:r>
+        <w:rPr>
+          <w:b/>
+          <w:bCs/>
+        </w:rPr>
+        <w:lastRenderedPageBreak/>
+        <w:t>circulatory system.</w:t>
+      </w:r>
+      <w:r>
+        <w:rPr>
+          <w:b/>
+          <w:bCs/>
+        </w:rPr>
+        <w:br/>
+        <w:t>Marks: 5</w:t>
+      </w:r>
+    </w:p>
+    <w:p>
+      <w:pPr>
+        <w:rPr>
+          <w:b/>
+          <w:bCs/>
+        </w:rPr>
+      </w:pPr>
+      <w:r>
+        <w:rPr>
+          <w:b/>
+          <w:bCs/>
+        </w:rPr>
+        <w:pict w14:anchorId="4DC288A3">
+          <v:rect id="_x0000_i1128" style="width:0;height:1.5pt" o:hralign="center" o:hrstd="t" o:hr="t" fillcolor="#a0a0a0" stroked="f"/>
         </w:pict>
       </w:r>
     </w:p>
@@ -194,6 +332,266 @@
           <w:bCs/>
         </w:rPr>
       </w:pPr>
+      <w:r>
+        <w:rPr>
+          <w:b/>
+          <w:bCs/>
+        </w:rPr>
+        <w:t>Q6. Define ecosystem.</w:t>
+      </w:r>
+    </w:p>
+    <w:p>
+      <w:pPr>
+        <w:rPr>
+          <w:b/>
+          <w:bCs/>
+        </w:rPr>
+      </w:pPr>
+      <w:r>
+        <w:rPr>
+          <w:b/>
+          <w:bCs/>
+        </w:rPr>
+        <w:t>Answer:</w:t>
+      </w:r>
+      <w:r>
+        <w:rPr>
+          <w:b/>
+          <w:bCs/>
+        </w:rPr>
+        <w:br/>
+        <w:t>An ecosystem is a community of living organisms interacting with each other and their physical environment. It includes both biotic (living) and abiotic (non-living) components. Energy flows through the system and nutrients are recycled. Examples include forests, ponds, and deserts.</w:t>
+      </w:r>
+      <w:r>
+        <w:rPr>
+          <w:b/>
+          <w:bCs/>
+        </w:rPr>
+        <w:br/>
+        <w:t>Marks: 5</w:t>
+      </w:r>
+    </w:p>
+    <w:p>
+      <w:pPr>
+        <w:rPr>
+          <w:b/>
+          <w:bCs/>
+        </w:rPr>
+      </w:pPr>
+      <w:r>
+        <w:rPr>
+          <w:b/>
+          <w:bCs/>
+        </w:rPr>
+        <w:pict w14:anchorId="3B00B14D">
+          <v:rect id="_x0000_i1129" style="width:0;height:1.5pt" o:hralign="center" o:hrstd="t" o:hr="t" fillcolor="#a0a0a0" stroked="f"/>
+        </w:pict>
+      </w:r>
+    </w:p>
+    <w:p>
+      <w:pPr>
+        <w:rPr>
+          <w:b/>
+          <w:bCs/>
+        </w:rPr>
+      </w:pPr>
+      <w:r>
+        <w:rPr>
+          <w:b/>
+          <w:bCs/>
+        </w:rPr>
+        <w:t>Q7. What is respiration?</w:t>
+      </w:r>
+    </w:p>
+    <w:p>
+      <w:pPr>
+        <w:rPr>
+          <w:b/>
+          <w:bCs/>
+        </w:rPr>
+      </w:pPr>
+      <w:r>
+        <w:rPr>
+          <w:b/>
+          <w:bCs/>
+        </w:rPr>
+        <w:t>Answer:</w:t>
+      </w:r>
+      <w:r>
+        <w:rPr>
+          <w:b/>
+          <w:bCs/>
+        </w:rPr>
+        <w:br/>
+        <w:t>Respiration is the process by which cells break down food to release energy. This energy is used for various life processes. Respiration can be aerobic (in the presence of oxygen) or anaerobic (without oxygen). It occurs in all living organisms.</w:t>
+      </w:r>
+      <w:r>
+        <w:rPr>
+          <w:b/>
+          <w:bCs/>
+        </w:rPr>
+        <w:br/>
+        <w:t>Marks: 5</w:t>
+      </w:r>
+    </w:p>
+    <w:p>
+      <w:pPr>
+        <w:rPr>
+          <w:b/>
+          <w:bCs/>
+        </w:rPr>
+      </w:pPr>
+      <w:r>
+        <w:rPr>
+          <w:b/>
+          <w:bCs/>
+        </w:rPr>
+        <w:pict w14:anchorId="249EB9E1">
+          <v:rect id="_x0000_i1130" style="width:0;height:1.5pt" o:hralign="center" o:hrstd="t" o:hr="t" fillcolor="#a0a0a0" stroked="f"/>
+        </w:pict>
+      </w:r>
+    </w:p>
+    <w:p>
+      <w:pPr>
+        <w:rPr>
+          <w:b/>
+          <w:bCs/>
+        </w:rPr>
+      </w:pPr>
+      <w:r>
+        <w:rPr>
+          <w:b/>
+          <w:bCs/>
+        </w:rPr>
+        <w:t>Q8. What are enzymes?</w:t>
+      </w:r>
+    </w:p>
+    <w:p>
+      <w:pPr>
+        <w:rPr>
+          <w:b/>
+          <w:bCs/>
+        </w:rPr>
+      </w:pPr>
+      <w:r>
+        <w:rPr>
+          <w:b/>
+          <w:bCs/>
+        </w:rPr>
+        <w:t>Answer:</w:t>
+      </w:r>
+      <w:r>
+        <w:rPr>
+          <w:b/>
+          <w:bCs/>
+        </w:rPr>
+        <w:br/>
+        <w:t>Enzymes are biological catalysts that speed up chemical reactions in living organisms. They are mostly proteins and are highly specific to their substrates. Enzymes play an important role in digestion, metabolism, and other cellular activities. They are not consumed during reactions.</w:t>
+      </w:r>
+      <w:r>
+        <w:rPr>
+          <w:b/>
+          <w:bCs/>
+        </w:rPr>
+        <w:br/>
+        <w:t>Marks: 5</w:t>
+      </w:r>
+    </w:p>
+    <w:p>
+      <w:pPr>
+        <w:rPr>
+          <w:b/>
+          <w:bCs/>
+        </w:rPr>
+      </w:pPr>
+      <w:r>
+        <w:rPr>
+          <w:b/>
+          <w:bCs/>
+        </w:rPr>
+        <w:pict w14:anchorId="784DBD95">
+          <v:rect id="_x0000_i1131" style="width:0;height:1.5pt" o:hralign="center" o:hrstd="t" o:hr="t" fillcolor="#a0a0a0" stroked="f"/>
+        </w:pict>
+      </w:r>
+    </w:p>
+    <w:p>
+      <w:pPr>
+        <w:rPr>
+          <w:b/>
+          <w:bCs/>
+        </w:rPr>
+      </w:pPr>
+      <w:r>
+        <w:rPr>
+          <w:b/>
+          <w:bCs/>
+        </w:rPr>
+        <w:t>Q9. What is natural selection?</w:t>
+      </w:r>
+    </w:p>
+    <w:p>
+      <w:pPr>
+        <w:rPr>
+          <w:b/>
+          <w:bCs/>
+        </w:rPr>
+      </w:pPr>
+      <w:r>
+        <w:rPr>
+          <w:b/>
+          <w:bCs/>
+        </w:rPr>
+        <w:t>Answer:</w:t>
+      </w:r>
+      <w:r>
+        <w:rPr>
+          <w:b/>
+          <w:bCs/>
+        </w:rPr>
+        <w:br/>
+        <w:t xml:space="preserve">Natural selection is a process in which organisms with </w:t>
+      </w:r>
+      <w:proofErr w:type="spellStart"/>
+      <w:r>
+        <w:rPr>
+          <w:b/>
+          <w:bCs/>
+        </w:rPr>
+        <w:t>favorable</w:t>
+      </w:r>
+      <w:proofErr w:type="spellEnd"/>
+      <w:r>
+        <w:rPr>
+          <w:b/>
+          <w:bCs/>
+        </w:rPr>
+        <w:t xml:space="preserve"> traits survive and reproduce more successfully. These traits are passed on to future generations. Over time, this leads to adaptation and evolution of species. This concept was proposed by Charles Darwin.</w:t>
+      </w:r>
+      <w:r>
+        <w:rPr>
+          <w:b/>
+          <w:bCs/>
+        </w:rPr>
+        <w:br/>
+        <w:t>Marks: 5</w:t>
+      </w:r>
+    </w:p>
+    <w:p>
+      <w:pPr>
+        <w:rPr>
+          <w:b/>
+          <w:bCs/>
+        </w:rPr>
+      </w:pPr>
+      <w:r>
+        <w:rPr>
+          <w:b/>
+          <w:bCs/>
+        </w:rPr>
+        <w:pict w14:anchorId="596EFCF5">
+          <v:rect id="_x0000_i1132" style="width:0;height:1.5pt" o:hralign="center" o:hrstd="t" o:hr="t" fillcolor="#a0a0a0" stroked="f"/>
+        </w:pict>
+      </w:r>
     </w:p>
     <w:p>
       <w:pPr>
@@ -208,10 +606,16 @@
           <w:bCs/>
         </w:rPr>
         <w:lastRenderedPageBreak/>
-        <w:t>Q6. Define ecosystem.</w:t>
-      </w:r>
-    </w:p>
-    <w:p>
+        <w:t>Q10. What is the role of chlorophyll?</w:t>
+      </w:r>
+    </w:p>
+    <w:p>
+      <w:pPr>
+        <w:rPr>
+          <w:b/>
+          <w:bCs/>
+        </w:rPr>
+      </w:pPr>
       <w:r>
         <w:rPr>
           <w:b/>
@@ -220,156 +624,20 @@
         <w:t>Answer:</w:t>
       </w:r>
       <w:r>
-        <w:br/>
-        <w:t>An ecosystem is a community of living organisms interacting with each other and their physical environment. It includes both biotic (living) and abiotic (non-living) components. Energy flows through the system and nutrients are recycled. Examples include forests, ponds, and deserts.</w:t>
-      </w:r>
-    </w:p>
-    <w:p>
-      <w:r>
-        <w:pict w14:anchorId="0FD1153F">
-          <v:rect id="_x0000_i1084" style="width:0;height:1.5pt" o:hralign="center" o:hrstd="t" o:hr="t" fillcolor="#a0a0a0" stroked="f"/>
-        </w:pict>
-      </w:r>
-    </w:p>
-    <w:p>
-      <w:pPr>
-        <w:rPr>
-          <w:b/>
-          <w:bCs/>
-        </w:rPr>
-      </w:pPr>
-      <w:r>
-        <w:rPr>
-          <w:b/>
-          <w:bCs/>
-        </w:rPr>
-        <w:t>Q7. What is respiration?</w:t>
-      </w:r>
-    </w:p>
-    <w:p>
-      <w:r>
-        <w:rPr>
-          <w:b/>
-          <w:bCs/>
-        </w:rPr>
-        <w:t>Answer:</w:t>
-      </w:r>
-      <w:r>
-        <w:br/>
-        <w:t>Respiration is the process by which cells break down food to release energy. This energy is used for various life processes. Respiration can be aerobic (in the presence of oxygen) or anaerobic (without oxygen). It occurs in all living organisms.</w:t>
-      </w:r>
-    </w:p>
-    <w:p>
-      <w:r>
-        <w:pict w14:anchorId="6328DE76">
-          <v:rect id="_x0000_i1085" style="width:0;height:1.5pt" o:hralign="center" o:hrstd="t" o:hr="t" fillcolor="#a0a0a0" stroked="f"/>
-        </w:pict>
-      </w:r>
-    </w:p>
-    <w:p>
-      <w:pPr>
-        <w:rPr>
-          <w:b/>
-          <w:bCs/>
-        </w:rPr>
-      </w:pPr>
-      <w:r>
-        <w:rPr>
-          <w:b/>
-          <w:bCs/>
-        </w:rPr>
-        <w:t>Q8. What are enzymes?</w:t>
-      </w:r>
-    </w:p>
-    <w:p>
-      <w:r>
-        <w:rPr>
-          <w:b/>
-          <w:bCs/>
-        </w:rPr>
-        <w:t>Answer:</w:t>
-      </w:r>
-      <w:r>
-        <w:br/>
-        <w:t>Enzymes are biological catalysts that speed up chemical reactions in living organisms. They are mostly proteins and are highly specific to their substrates. Enzymes play an important role in digestion, metabolism, and other cellular activities. They are not consumed during reactions.</w:t>
-      </w:r>
-    </w:p>
-    <w:p>
-      <w:r>
-        <w:pict w14:anchorId="31EB4722">
-          <v:rect id="_x0000_i1086" style="width:0;height:1.5pt" o:hralign="center" o:hrstd="t" o:hr="t" fillcolor="#a0a0a0" stroked="f"/>
-        </w:pict>
-      </w:r>
-    </w:p>
-    <w:p>
-      <w:pPr>
-        <w:rPr>
-          <w:b/>
-          <w:bCs/>
-        </w:rPr>
-      </w:pPr>
-      <w:r>
-        <w:rPr>
-          <w:b/>
-          <w:bCs/>
-        </w:rPr>
-        <w:t>Q9. What is natural selection?</w:t>
-      </w:r>
-    </w:p>
-    <w:p>
-      <w:r>
-        <w:rPr>
-          <w:b/>
-          <w:bCs/>
-        </w:rPr>
-        <w:t>Answer:</w:t>
-      </w:r>
-      <w:r>
-        <w:br/>
-        <w:t xml:space="preserve">Natural selection is a process in which organisms with </w:t>
-      </w:r>
-      <w:proofErr w:type="spellStart"/>
-      <w:r>
-        <w:t>favorable</w:t>
-      </w:r>
-      <w:proofErr w:type="spellEnd"/>
-      <w:r>
-        <w:t xml:space="preserve"> traits survive and reproduce more successfully. These traits are passed on to future generations. Over time, this leads to adaptation and evolution of species. This concept was proposed by Charles Darwin.</w:t>
-      </w:r>
-    </w:p>
-    <w:p>
-      <w:r>
-        <w:pict w14:anchorId="2A14BD44">
-          <v:rect id="_x0000_i1087" style="width:0;height:1.5pt" o:hralign="center" o:hrstd="t" o:hr="t" fillcolor="#a0a0a0" stroked="f"/>
-        </w:pict>
-      </w:r>
-    </w:p>
-    <w:p>
-      <w:pPr>
-        <w:rPr>
-          <w:b/>
-          <w:bCs/>
-        </w:rPr>
-      </w:pPr>
-      <w:r>
-        <w:rPr>
-          <w:b/>
-          <w:bCs/>
-        </w:rPr>
-        <w:t>Q10. What is the role of chlorophyll?</w:t>
-      </w:r>
-    </w:p>
-    <w:p>
-      <w:r>
-        <w:rPr>
-          <w:b/>
-          <w:bCs/>
-        </w:rPr>
-        <w:t>Answer:</w:t>
-      </w:r>
-      <w:r>
+        <w:rPr>
+          <w:b/>
+          <w:bCs/>
+        </w:rPr>
         <w:br/>
         <w:t>Chlorophyll is a green pigment found in plant cells, mainly in chloroplasts. It absorbs sunlight, especially red and blue wavelengths, for photosynthesis. This energy is used to convert carbon dioxide and water into glucose. It plays a key role in food production in plants.</w:t>
+      </w:r>
+      <w:r>
+        <w:rPr>
+          <w:b/>
+          <w:bCs/>
+        </w:rPr>
+        <w:br/>
+        <w:t>Marks: 5</w:t>
       </w:r>
     </w:p>
     <w:p/>

</xml_diff>